<commit_message>
Vendor TPOUR source directly so normal clones include upstream files
</commit_message>
<xml_diff>
--- a/reports/Bao_cao_chi_tiet_TPOUR_TRPO.docx
+++ b/reports/Bao_cao_chi_tiet_TPOUR_TRPO.docx
@@ -5908,7 +5908,7 @@
           <w:rFonts w:ascii="Consolas" w:hAnsi="Consolas"/>
           <w:sz w:val="17"/>
         </w:rPr>
-        <w:t>git clone --recurse-submodules `</w:t>
+        <w:t>git clone `</w:t>
       </w:r>
       <w:r>
         <w:br/>
@@ -5959,7 +5959,7 @@
         <w:rPr>
           <w:b w:val="0"/>
         </w:rPr>
-        <w:t>Ví dụ lệnh dùng PowerShell; dấu backtick ở cuối dòng nối lệnh sang dòng sau. Trên Linux/macOS dùng một dòng và thay đường dẫn Python môi trường ảo bằng .venv/bin/python. Clone submodule để có đúng commit code tác giả.</w:t>
+        <w:t>Ví dụ lệnh dùng PowerShell; dấu backtick ở cuối dòng nối lệnh sang dòng sau. Trên Linux/macOS dùng một dòng và thay đường dẫn Python môi trường ảo bằng .venv/bin/python. Mã tác giả nằm trực tiếp trong upstream/TPOUR; commit và hash gốc được ghi trong upstream/UPSTREAM.json, không cần lệnh submodule.</w:t>
       </w:r>
     </w:p>
     <w:p>
@@ -6518,7 +6518,7 @@
         <w:rPr>
           <w:b w:val="0"/>
         </w:rPr>
-        <w:t>[2] agwaBom/TPOUR. Repository triển khai chính thức. https://github.com/agwaBom/TPOUR. Commit được giữ trong submodule: d1d8e70326deae6ef2ea03a8cb2c0cbc60db7a78. Tệp src/moco.py và finetune.sh.</w:t>
+        <w:t>[2] agwaBom/TPOUR. Repository triển khai chính thức. https://github.com/agwaBom/TPOUR. Mã được lưu trực tiếp trong upstream/TPOUR, tại commit gốc: d1d8e70326deae6ef2ea03a8cb2c0cbc60db7a78. Tệp src/moco.py và finetune.sh; provenance ở upstream/UPSTREAM.json.</w:t>
       </w:r>
     </w:p>
     <w:p>

</xml_diff>